<commit_message>
docs: update Requirements + academic resources to current progress
- Requirements: AI coach section reflects the full companion (photo chat,
  one-tap logging, cooking guidance, VI/EN); weekly AI plan generation
  marked done (taste note, today-forward, per-day regenerate); new
  sections for the AI grocery list + today's-plan card and the
  structured-JSON generation method (calorie bound, fallback keys);
  status/roadmap section VII refreshed (now doing: full i18n + community
  & workout redo)
- Academic resources: LLM/RAG group now also grounds plan generation and
  grocery list; usage note maps each app feature to its source group
</commit_message>
<xml_diff>
--- a/Requirements.docx
+++ b/Requirements.docx
@@ -280,20 +280,20 @@
         <w:spacing w:after="80" w:line="290" w:lineRule="auto"/>
       </w:pPr>
       <w:r>
-        <w:t>Trò chuyện, người dùng hỏi bất kỳ điều gì về ăn uống và vận động, trợ lý trả lời dựa trên dữ liệu cá nhân thực tế của người đó.</w:t>
-      </w:r>
-    </w:p>
-    <w:p>
-      <w:pPr>
-        <w:pStyle w:val="ListParagraph"/>
-        <w:numPr>
-          <w:ilvl w:val="0"/>
-          <w:numId w:val="2"/>
-        </w:numPr>
-        <w:spacing w:after="80" w:line="290" w:lineRule="auto"/>
-      </w:pPr>
-      <w:r>
-        <w:t>Tự sinh kế hoạch thực đơn và lịch tập cho cả tuần. Phần này đang trong quá trình phát triển.</w:t>
+        <w:t>Trò chuyện như một người bạn đồng hành, người dùng hỏi về ăn uống, vận động hoặc gửi ảnh món ăn, trợ lý trả lời theo dữ liệu cá nhân, hỏi lại để tư vấn sát hơn, chỉ cách nấu phù hợp bệnh lý và cho ghi món đang ăn vào nhật ký bằng một nút bấm.</w:t>
+      </w:r>
+    </w:p>
+    <w:p>
+      <w:pPr>
+        <w:pStyle w:val="ListParagraph"/>
+        <w:numPr>
+          <w:ilvl w:val="0"/>
+          <w:numId w:val="2"/>
+        </w:numPr>
+        <w:spacing w:after="80" w:line="290" w:lineRule="auto"/>
+      </w:pPr>
+      <w:r>
+        <w:t>Tự sinh kế hoạch thực đơn bảy ngày kèm gợi ý vận động mỗi ngày theo mục tiêu và bệnh lý, chỉ tạo từ ngày hiện tại trở đi, có ô ghi chú khẩu vị và cho phép làm lại thực đơn của một ngày bất kỳ.</w:t>
       </w:r>
     </w:p>
     <w:p>
@@ -303,7 +303,24 @@
       </w:pPr>
       <w:r>
         <w:lastRenderedPageBreak/>
-        <w:t>Lịch sử trò chuyện được lưu lại theo tài khoản. Mọi câu trả lời đều kèm lưu ý rằng đây là hướng dẫn tham khảo, không thay thế ý kiến của bác sĩ.</w:t>
+        <w:t>Lịch sử trò chuyện được lưu theo tài khoản, bao gồm cả hình ảnh đã gửi. Trợ lý trả lời theo ngôn ngữ người dùng chọn, tiếng Việt hoặc tiếng Anh. Mọi câu trả lời đều kèm lưu ý rằng đây là hướng dẫn tham khảo, không thay thế ý kiến của bác sĩ.</w:t>
+      </w:r>
+    </w:p>
+    <w:p>
+      <w:pPr>
+        <w:pStyle w:val="Heading2"/>
+      </w:pPr>
+      <w:r>
+        <w:t>J. Danh sách đi chợ và thẻ kế hoạch hôm nay</w:t>
+      </w:r>
+    </w:p>
+    <w:p>
+      <w:pPr>
+        <w:spacing w:after="140" w:line="300" w:lineRule="auto"/>
+        <w:jc w:val="both"/>
+      </w:pPr>
+      <w:r>
+        <w:t>Từ kế hoạch tuần đang có, người dùng bấm một nút để trí tuệ nhân tạo tổng hợp danh sách nguyên liệu cần mua, gộp các nguyên liệu trùng nhau giữa các món, chia theo nhóm như thịt cá, rau củ, đồ khô và ước lượng số lượng cho một người. Trang chính cũng có thẻ kế hoạch hôm nay hiển thị các món chưa ăn cùng gợi ý vận động của ngày.</w:t>
       </w:r>
     </w:p>
     <w:p>
@@ -771,6 +788,23 @@
     </w:p>
     <w:p>
       <w:pPr>
+        <w:pStyle w:val="Heading2"/>
+      </w:pPr>
+      <w:r>
+        <w:t>H. Sinh kế hoạch và danh sách đi chợ bằng trí tuệ nhân tạo</w:t>
+      </w:r>
+    </w:p>
+    <w:p>
+      <w:pPr>
+        <w:spacing w:after="140" w:line="300" w:lineRule="auto"/>
+        <w:jc w:val="both"/>
+      </w:pPr>
+      <w:r>
+        <w:t>Ứng dụng yêu cầu mô hình trả về kết quả theo cấu trúc JSON định sẵn để kiểm tra được từng món trước khi lưu vào cơ sở dữ liệu. Kế hoạch tuần bị ràng buộc tổng calo mỗi ngày trong khoảng cộng trừ mười phần trăm so với mục tiêu, ưu tiên món Việt, không lặp món hai ngày liền và điều chỉnh theo bệnh lý cùng ghi chú khẩu vị của người dùng. Hệ thống dùng nhiều khóa và nhiều mô hình dự phòng, khi một mô hình hết hạn mức sẽ tự chuyển sang mô hình kế tiếp.</w:t>
+      </w:r>
+    </w:p>
+    <w:p>
+      <w:pPr>
         <w:pStyle w:val="Heading1"/>
       </w:pPr>
       <w:r>
@@ -797,7 +831,7 @@
         <w:spacing w:after="80" w:line="290" w:lineRule="auto"/>
       </w:pPr>
       <w:r>
-        <w:t>Hoàn thiện phần tự sinh kế hoạch của trợ lý, để trí tuệ nhân tạo tạo ra thực đơn 7 ngày và lịch tập phù hợp mục tiêu, mục tiêu calo và bệnh lý, ưu tiên món Việt Nam, sau đó tự đổ vào phần kế hoạch thực đơn đã có sẵn.</w:t>
+        <w:t>Làm lại giao diện và trải nghiệm của phần cộng đồng và phần ghi nhận vận động cho hoàn thiện hơn.</w:t>
       </w:r>
     </w:p>
     <w:p>
@@ -987,10 +1021,7 @@
       </w:pPr>
       <w:r>
         <w:lastRenderedPageBreak/>
-        <w:t>A</w:t>
-      </w:r>
-      <w:r>
-        <w:t>. Đã hoàn thành</w:t>
+        <w:t>A. Đã hoàn thành</w:t>
       </w:r>
     </w:p>
     <w:p>
@@ -1055,7 +1086,20 @@
         <w:spacing w:after="80" w:line="290" w:lineRule="auto"/>
       </w:pPr>
       <w:r>
-        <w:t>Trợ lý sức khỏe trí tuệ nhân tạo với phần phân tích chủ động hằng ngày và phần trò chuyện có dữ liệu cá nhân.</w:t>
+        <w:t>Trợ lý sức khỏe trí tuệ nhân tạo gồm phân tích chủ động hằng ngày, trò chuyện có dữ liệu cá nhân, nhận ảnh món ăn, ghi nhật ký bằng một nút bấm và hỗ trợ hai ngôn ngữ.</w:t>
+      </w:r>
+    </w:p>
+    <w:p>
+      <w:pPr>
+        <w:pStyle w:val="ListParagraph"/>
+        <w:numPr>
+          <w:ilvl w:val="0"/>
+          <w:numId w:val="2"/>
+        </w:numPr>
+        <w:spacing w:after="80" w:line="290" w:lineRule="auto"/>
+      </w:pPr>
+      <w:r>
+        <w:t>Trí tuệ nhân tạo tự sinh kế hoạch tuần kèm gợi ý vận động từng ngày và danh sách đi chợ tổng hợp từ kế hoạch.</w:t>
       </w:r>
     </w:p>
     <w:p>
@@ -1063,19 +1107,16 @@
         <w:pStyle w:val="Heading2"/>
       </w:pPr>
       <w:r>
-        <w:t>B</w:t>
-      </w:r>
-      <w:r>
-        <w:t>. Đang làm</w:t>
-      </w:r>
-    </w:p>
-    <w:p>
-      <w:pPr>
-        <w:spacing w:after="140" w:line="300" w:lineRule="auto"/>
-        <w:jc w:val="both"/>
-      </w:pPr>
-      <w:r>
-        <w:t>Hoàn thiện phần tự sinh kế hoạch của trợ lý, để trí tuệ nhân tạo tạo ra thực đơn bảy ngày và lịch tập phù hợp mục tiêu, mục tiêu calo và bệnh lý của người dùng, ưu tiên món Việt Nam, rồi tự đổ vào phần kế hoạch thực đơn đã có.</w:t>
+        <w:t>B. Đang làm</w:t>
+      </w:r>
+    </w:p>
+    <w:p>
+      <w:pPr>
+        <w:spacing w:after="140" w:line="300" w:lineRule="auto"/>
+        <w:jc w:val="both"/>
+      </w:pPr>
+      <w:r>
+        <w:t>Hoàn thiện song ngữ tiếng Việt và tiếng Anh cho toàn bộ ứng dụng, hiện mới có ở trợ lý, kế hoạch và cài đặt, đồng thời chuẩn bị làm lại phần cộng đồng và phần vận động.</w:t>
       </w:r>
     </w:p>
     <w:p>
@@ -1083,10 +1124,7 @@
         <w:pStyle w:val="Heading2"/>
       </w:pPr>
       <w:r>
-        <w:t>C</w:t>
-      </w:r>
-      <w:r>
-        <w:t>. Sắp làm</w:t>
+        <w:t>C. Sắp làm</w:t>
       </w:r>
     </w:p>
     <w:p>
@@ -1164,7 +1202,7 @@
         <w:spacing w:after="80" w:line="290" w:lineRule="auto"/>
       </w:pPr>
       <w:r>
-        <w:t>Hỗ trợ song ngữ tiếng Việt và tiếng Anh.</w:t>
+        <w:t>Nút gợi ý nhanh nên ăn gì lúc này trên trang chính và lời nhắc chủ động từ trợ lý qua thông báo.</w:t>
       </w:r>
     </w:p>
     <w:p>
@@ -1172,19 +1210,16 @@
         <w:pStyle w:val="Heading2"/>
       </w:pPr>
       <w:r>
-        <w:t>D</w:t>
-      </w:r>
-      <w:r>
-        <w:t>. Lộ trình dự kiến tới tháng 8 năm 2026</w:t>
-      </w:r>
-    </w:p>
-    <w:p>
-      <w:pPr>
-        <w:spacing w:after="140" w:line="300" w:lineRule="auto"/>
-        <w:jc w:val="both"/>
-      </w:pPr>
-      <w:r>
-        <w:t>Giai đoạn gần nhất tập trung hoàn thiện trợ lý trí tuệ nhân tạo gồm phần tự sinh kế hoạch và phần giải thích lời khuyên. Giai đoạn kế tiếp bổ sung cơ sở dữ liệu món Việt, theo dõi uống nước và bộ kịch bản đánh giá. Giai đoạn cuối dành cho kiểm thử tổng thể, hoàn thiện giao diện và viết báo cáo. Phần tích hợp dữ liệu sức khỏe từ thiết bị đeo được xếp vào hướng phát triển sau khi bảo vệ.</w:t>
+        <w:t>D. Lộ trình dự kiến tới tháng 8 năm 2026</w:t>
+      </w:r>
+    </w:p>
+    <w:p>
+      <w:pPr>
+        <w:spacing w:after="140" w:line="300" w:lineRule="auto"/>
+        <w:jc w:val="both"/>
+      </w:pPr>
+      <w:r>
+        <w:t>Giai đoạn gần nhất tập trung hoàn thiện song ngữ toàn ứng dụng và làm lại phần cộng đồng cùng phần vận động. Giai đoạn kế tiếp bổ sung cơ sở dữ liệu món Việt, bộ kịch bản đánh giá trợ lý, theo dõi uống nước và các tiện ích như lời nhắc chủ động, biểu đồ điểm sức khỏe. Giai đoạn cuối dành cho kiểm thử tổng thể, hoàn thiện giao diện và viết báo cáo. Phần tích hợp dữ liệu sức khỏe từ thiết bị đeo được xếp vào hướng phát triển sau khi bảo vệ.</w:t>
       </w:r>
     </w:p>
     <w:sectPr>

</xml_diff>